<commit_message>
docs: rename project title
</commit_message>
<xml_diff>
--- a/2025/05_delivery/项目主报告_终稿.docx
+++ b/2025/05_delivery/项目主报告_终稿.docx
@@ -13,7 +13,7 @@
           <w:color w:val="000000"/>
           <w:sz w:val="32"/>
         </w:rPr>
-        <w:t>光伏电站日前计划与功率预测工作台项目主报告</w:t>
+        <w:t>光伏电站日前功率预测与运行工作台项目主报告</w:t>
       </w:r>
     </w:p>
     <w:p/>
@@ -454,7 +454,7 @@
           <w:sz w:val="32"/>
         </w:rPr>
         <w:lastRenderedPageBreak/>
-        <w:t>PV STATION DAY-AHEAD PLANNING AND POWER FORECASTING WORKBENCH</w:t>
+        <w:t>PV STATION DAY-AHEAD POWER FORECASTING AND OPERATION WORKBENCH</w:t>
       </w:r>
     </w:p>
     <w:p/>
@@ -595,7 +595,7 @@
         </w:rPr>
         <w:fldChar w:fldCharType="separate"/>
       </w:r>
-      <w:hyperlink w:anchor="_Toc233836012" w:history="1">
+      <w:hyperlink w:anchor="_Toc233897005" w:history="1">
         <w:r>
           <w:rPr>
             <w:rStyle w:val="aff9"/>
@@ -648,7 +648,7 @@
             <w:webHidden/>
             <w:sz w:val="21"/>
           </w:rPr>
-          <w:instrText>PAGEREF _Toc233836012 \h</w:instrText>
+          <w:instrText>PAGEREF _Toc233897005 \h</w:instrText>
         </w:r>
         <w:r>
           <w:rPr>
@@ -710,7 +710,7 @@
           <w:sz w:val="21"/>
         </w:rPr>
       </w:pPr>
-      <w:hyperlink w:anchor="_Toc233836013" w:history="1">
+      <w:hyperlink w:anchor="_Toc233897006" w:history="1">
         <w:r>
           <w:rPr>
             <w:rStyle w:val="aff9"/>
@@ -763,7 +763,7 @@
             <w:webHidden/>
             <w:sz w:val="21"/>
           </w:rPr>
-          <w:instrText>PAGEREF _Toc233836013 \h</w:instrText>
+          <w:instrText>PAGEREF _Toc233897006 \h</w:instrText>
         </w:r>
         <w:r>
           <w:rPr>
@@ -825,7 +825,7 @@
           <w:sz w:val="21"/>
         </w:rPr>
       </w:pPr>
-      <w:hyperlink w:anchor="_Toc233836014" w:history="1">
+      <w:hyperlink w:anchor="_Toc233897007" w:history="1">
         <w:r>
           <w:rPr>
             <w:rStyle w:val="aff9"/>
@@ -878,7 +878,7 @@
             <w:webHidden/>
             <w:sz w:val="21"/>
           </w:rPr>
-          <w:instrText>PAGEREF _Toc233836014 \h</w:instrText>
+          <w:instrText>PAGEREF _Toc233897007 \h</w:instrText>
         </w:r>
         <w:r>
           <w:rPr>
@@ -940,7 +940,7 @@
           <w:sz w:val="21"/>
         </w:rPr>
       </w:pPr>
-      <w:hyperlink w:anchor="_Toc233836015" w:history="1">
+      <w:hyperlink w:anchor="_Toc233897008" w:history="1">
         <w:r>
           <w:rPr>
             <w:rStyle w:val="aff9"/>
@@ -993,7 +993,7 @@
             <w:webHidden/>
             <w:sz w:val="21"/>
           </w:rPr>
-          <w:instrText>PAGEREF _Toc233836015 \h</w:instrText>
+          <w:instrText>PAGEREF _Toc233897008 \h</w:instrText>
         </w:r>
         <w:r>
           <w:rPr>
@@ -1054,7 +1054,7 @@
           <w:sz w:val="21"/>
         </w:rPr>
       </w:pPr>
-      <w:hyperlink w:anchor="_Toc233836016" w:history="1">
+      <w:hyperlink w:anchor="_Toc233897009" w:history="1">
         <w:r>
           <w:rPr>
             <w:rStyle w:val="aff9"/>
@@ -1107,7 +1107,7 @@
             <w:webHidden/>
             <w:sz w:val="21"/>
           </w:rPr>
-          <w:instrText>PAGEREF _Toc233836016 \h</w:instrText>
+          <w:instrText>PAGEREF _Toc233897009 \h</w:instrText>
         </w:r>
         <w:r>
           <w:rPr>
@@ -1169,7 +1169,7 @@
           <w:sz w:val="21"/>
         </w:rPr>
       </w:pPr>
-      <w:hyperlink w:anchor="_Toc233836017" w:history="1">
+      <w:hyperlink w:anchor="_Toc233897010" w:history="1">
         <w:r>
           <w:rPr>
             <w:rStyle w:val="aff9"/>
@@ -1222,7 +1222,7 @@
             <w:webHidden/>
             <w:sz w:val="21"/>
           </w:rPr>
-          <w:instrText>PAGEREF _Toc233836017 \h</w:instrText>
+          <w:instrText>PAGEREF _Toc233897010 \h</w:instrText>
         </w:r>
         <w:r>
           <w:rPr>
@@ -1284,7 +1284,7 @@
           <w:sz w:val="21"/>
         </w:rPr>
       </w:pPr>
-      <w:hyperlink w:anchor="_Toc233836018" w:history="1">
+      <w:hyperlink w:anchor="_Toc233897011" w:history="1">
         <w:r>
           <w:rPr>
             <w:rStyle w:val="aff9"/>
@@ -1337,7 +1337,7 @@
             <w:webHidden/>
             <w:sz w:val="21"/>
           </w:rPr>
-          <w:instrText>PAGEREF _Toc233836018 \h</w:instrText>
+          <w:instrText>PAGEREF _Toc233897011 \h</w:instrText>
         </w:r>
         <w:r>
           <w:rPr>
@@ -1399,7 +1399,7 @@
           <w:sz w:val="21"/>
         </w:rPr>
       </w:pPr>
-      <w:hyperlink w:anchor="_Toc233836019" w:history="1">
+      <w:hyperlink w:anchor="_Toc233897012" w:history="1">
         <w:r>
           <w:rPr>
             <w:rStyle w:val="aff9"/>
@@ -1452,7 +1452,7 @@
             <w:webHidden/>
             <w:sz w:val="21"/>
           </w:rPr>
-          <w:instrText>PAGEREF _Toc233836019 \h</w:instrText>
+          <w:instrText>PAGEREF _Toc233897012 \h</w:instrText>
         </w:r>
         <w:r>
           <w:rPr>
@@ -1513,7 +1513,7 @@
           <w:sz w:val="21"/>
         </w:rPr>
       </w:pPr>
-      <w:hyperlink w:anchor="_Toc233836020" w:history="1">
+      <w:hyperlink w:anchor="_Toc233897013" w:history="1">
         <w:r>
           <w:rPr>
             <w:rStyle w:val="aff9"/>
@@ -1566,7 +1566,7 @@
             <w:webHidden/>
             <w:sz w:val="21"/>
           </w:rPr>
-          <w:instrText>PAGEREF _Toc233836020 \h</w:instrText>
+          <w:instrText>PAGEREF _Toc233897013 \h</w:instrText>
         </w:r>
         <w:r>
           <w:rPr>
@@ -1628,7 +1628,7 @@
           <w:sz w:val="21"/>
         </w:rPr>
       </w:pPr>
-      <w:hyperlink w:anchor="_Toc233836021" w:history="1">
+      <w:hyperlink w:anchor="_Toc233897014" w:history="1">
         <w:r>
           <w:rPr>
             <w:rStyle w:val="aff9"/>
@@ -1681,7 +1681,7 @@
             <w:webHidden/>
             <w:sz w:val="21"/>
           </w:rPr>
-          <w:instrText>PAGEREF _Toc233836021 \h</w:instrText>
+          <w:instrText>PAGEREF _Toc233897014 \h</w:instrText>
         </w:r>
         <w:r>
           <w:rPr>
@@ -1743,7 +1743,7 @@
           <w:sz w:val="21"/>
         </w:rPr>
       </w:pPr>
-      <w:hyperlink w:anchor="_Toc233836022" w:history="1">
+      <w:hyperlink w:anchor="_Toc233897015" w:history="1">
         <w:r>
           <w:rPr>
             <w:rStyle w:val="aff9"/>
@@ -1796,7 +1796,7 @@
             <w:webHidden/>
             <w:sz w:val="21"/>
           </w:rPr>
-          <w:instrText>PAGEREF _Toc233836022 \h</w:instrText>
+          <w:instrText>PAGEREF _Toc233897015 \h</w:instrText>
         </w:r>
         <w:r>
           <w:rPr>
@@ -1858,7 +1858,7 @@
           <w:sz w:val="21"/>
         </w:rPr>
       </w:pPr>
-      <w:hyperlink w:anchor="_Toc233836023" w:history="1">
+      <w:hyperlink w:anchor="_Toc233897016" w:history="1">
         <w:r>
           <w:rPr>
             <w:rStyle w:val="aff9"/>
@@ -1911,7 +1911,7 @@
             <w:webHidden/>
             <w:sz w:val="21"/>
           </w:rPr>
-          <w:instrText>PAGEREF _Toc233836023 \h</w:instrText>
+          <w:instrText>PAGEREF _Toc233897016 \h</w:instrText>
         </w:r>
         <w:r>
           <w:rPr>
@@ -1973,7 +1973,7 @@
           <w:sz w:val="21"/>
         </w:rPr>
       </w:pPr>
-      <w:hyperlink w:anchor="_Toc233836024" w:history="1">
+      <w:hyperlink w:anchor="_Toc233897017" w:history="1">
         <w:r>
           <w:rPr>
             <w:rStyle w:val="aff9"/>
@@ -2026,7 +2026,7 @@
             <w:webHidden/>
             <w:sz w:val="21"/>
           </w:rPr>
-          <w:instrText>PAGEREF _Toc233836024 \h</w:instrText>
+          <w:instrText>PAGEREF _Toc233897017 \h</w:instrText>
         </w:r>
         <w:r>
           <w:rPr>
@@ -2088,7 +2088,7 @@
           <w:sz w:val="21"/>
         </w:rPr>
       </w:pPr>
-      <w:hyperlink w:anchor="_Toc233836025" w:history="1">
+      <w:hyperlink w:anchor="_Toc233897018" w:history="1">
         <w:r>
           <w:rPr>
             <w:rStyle w:val="aff9"/>
@@ -2141,7 +2141,7 @@
             <w:webHidden/>
             <w:sz w:val="21"/>
           </w:rPr>
-          <w:instrText>PAGEREF _Toc233836025 \h</w:instrText>
+          <w:instrText>PAGEREF _Toc233897018 \h</w:instrText>
         </w:r>
         <w:r>
           <w:rPr>
@@ -2203,7 +2203,7 @@
           <w:sz w:val="21"/>
         </w:rPr>
       </w:pPr>
-      <w:hyperlink w:anchor="_Toc233836026" w:history="1">
+      <w:hyperlink w:anchor="_Toc233897019" w:history="1">
         <w:r>
           <w:rPr>
             <w:rStyle w:val="aff9"/>
@@ -2256,7 +2256,7 @@
             <w:webHidden/>
             <w:sz w:val="21"/>
           </w:rPr>
-          <w:instrText>PAGEREF _Toc233836026 \h</w:instrText>
+          <w:instrText>PAGEREF _Toc233897019 \h</w:instrText>
         </w:r>
         <w:r>
           <w:rPr>
@@ -2317,7 +2317,7 @@
           <w:sz w:val="21"/>
         </w:rPr>
       </w:pPr>
-      <w:hyperlink w:anchor="_Toc233836027" w:history="1">
+      <w:hyperlink w:anchor="_Toc233897020" w:history="1">
         <w:r>
           <w:rPr>
             <w:rStyle w:val="aff9"/>
@@ -2370,7 +2370,7 @@
             <w:webHidden/>
             <w:sz w:val="21"/>
           </w:rPr>
-          <w:instrText>PAGEREF _Toc233836027 \h</w:instrText>
+          <w:instrText>PAGEREF _Toc233897020 \h</w:instrText>
         </w:r>
         <w:r>
           <w:rPr>
@@ -2432,7 +2432,7 @@
           <w:sz w:val="21"/>
         </w:rPr>
       </w:pPr>
-      <w:hyperlink w:anchor="_Toc233836028" w:history="1">
+      <w:hyperlink w:anchor="_Toc233897021" w:history="1">
         <w:r>
           <w:rPr>
             <w:rStyle w:val="aff9"/>
@@ -2485,7 +2485,7 @@
             <w:webHidden/>
             <w:sz w:val="21"/>
           </w:rPr>
-          <w:instrText>PAGEREF _Toc233836028 \h</w:instrText>
+          <w:instrText>PAGEREF _Toc233897021 \h</w:instrText>
         </w:r>
         <w:r>
           <w:rPr>
@@ -2547,7 +2547,7 @@
           <w:sz w:val="21"/>
         </w:rPr>
       </w:pPr>
-      <w:hyperlink w:anchor="_Toc233836029" w:history="1">
+      <w:hyperlink w:anchor="_Toc233897022" w:history="1">
         <w:r>
           <w:rPr>
             <w:rStyle w:val="aff9"/>
@@ -2600,7 +2600,7 @@
             <w:webHidden/>
             <w:sz w:val="21"/>
           </w:rPr>
-          <w:instrText>PAGEREF _Toc233836029 \h</w:instrText>
+          <w:instrText>PAGEREF _Toc233897022 \h</w:instrText>
         </w:r>
         <w:r>
           <w:rPr>
@@ -2662,7 +2662,7 @@
           <w:sz w:val="21"/>
         </w:rPr>
       </w:pPr>
-      <w:hyperlink w:anchor="_Toc233836030" w:history="1">
+      <w:hyperlink w:anchor="_Toc233897023" w:history="1">
         <w:r>
           <w:rPr>
             <w:rStyle w:val="aff9"/>
@@ -2715,7 +2715,7 @@
             <w:webHidden/>
             <w:sz w:val="21"/>
           </w:rPr>
-          <w:instrText>PAGEREF _Toc233836030 \h</w:instrText>
+          <w:instrText>PAGEREF _Toc233897023 \h</w:instrText>
         </w:r>
         <w:r>
           <w:rPr>
@@ -2776,7 +2776,7 @@
           <w:sz w:val="21"/>
         </w:rPr>
       </w:pPr>
-      <w:hyperlink w:anchor="_Toc233836031" w:history="1">
+      <w:hyperlink w:anchor="_Toc233897024" w:history="1">
         <w:r>
           <w:rPr>
             <w:rStyle w:val="aff9"/>
@@ -2829,7 +2829,7 @@
             <w:webHidden/>
             <w:sz w:val="21"/>
           </w:rPr>
-          <w:instrText>PAGEREF _Toc233836031 \h</w:instrText>
+          <w:instrText>PAGEREF _Toc233897024 \h</w:instrText>
         </w:r>
         <w:r>
           <w:rPr>
@@ -2890,7 +2890,7 @@
           <w:sz w:val="21"/>
         </w:rPr>
       </w:pPr>
-      <w:hyperlink w:anchor="_Toc233836032" w:history="1">
+      <w:hyperlink w:anchor="_Toc233897025" w:history="1">
         <w:r>
           <w:rPr>
             <w:rStyle w:val="aff9"/>
@@ -2952,7 +2952,7 @@
             <w:webHidden/>
             <w:sz w:val="21"/>
           </w:rPr>
-          <w:instrText>PAGEREF _Toc233836032 \h</w:instrText>
+          <w:instrText>PAGEREF _Toc233897025 \h</w:instrText>
         </w:r>
         <w:r>
           <w:rPr>
@@ -3013,7 +3013,7 @@
           <w:sz w:val="21"/>
         </w:rPr>
       </w:pPr>
-      <w:hyperlink w:anchor="_Toc233836033" w:history="1">
+      <w:hyperlink w:anchor="_Toc233897026" w:history="1">
         <w:r>
           <w:rPr>
             <w:rStyle w:val="aff9"/>
@@ -3075,7 +3075,7 @@
             <w:webHidden/>
             <w:sz w:val="21"/>
           </w:rPr>
-          <w:instrText>PAGEREF _Toc233836033 \h</w:instrText>
+          <w:instrText>PAGEREF _Toc233897026 \h</w:instrText>
         </w:r>
         <w:r>
           <w:rPr>
@@ -3146,7 +3146,7 @@
         <w:spacing w:before="360" w:after="360" w:line="360" w:lineRule="exact"/>
         <w:jc w:val="center"/>
       </w:pPr>
-      <w:bookmarkStart w:id="0" w:name="_Toc233836012"/>
+      <w:bookmarkStart w:id="0" w:name="_Toc233897005"/>
       <w:r>
         <w:rPr>
           <w:rFonts w:ascii="Times New Roman" w:eastAsia="黑体" w:hAnsi="Times New Roman"/>
@@ -3167,7 +3167,7 @@
         <w:pStyle w:val="21"/>
         <w:spacing w:before="0" w:line="360" w:lineRule="exact"/>
       </w:pPr>
-      <w:bookmarkStart w:id="1" w:name="_Toc233836013"/>
+      <w:bookmarkStart w:id="1" w:name="_Toc233897006"/>
       <w:r>
         <w:rPr>
           <w:rFonts w:ascii="Times New Roman" w:eastAsia="黑体" w:hAnsi="Times New Roman"/>
@@ -3229,7 +3229,7 @@
         <w:rPr>
           <w:color w:val="000000"/>
         </w:rPr>
-        <w:t>光伏电站日前计划与功率预测工作台</w:t>
+        <w:t>光伏电站日前功率预测与运行工作台</w:t>
       </w:r>
       <w:r>
         <w:rPr>
@@ -3262,7 +3262,7 @@
         <w:pStyle w:val="21"/>
         <w:spacing w:before="0" w:line="360" w:lineRule="exact"/>
       </w:pPr>
-      <w:bookmarkStart w:id="2" w:name="_Toc233836014"/>
+      <w:bookmarkStart w:id="2" w:name="_Toc233897007"/>
       <w:r>
         <w:rPr>
           <w:rFonts w:ascii="Times New Roman" w:eastAsia="黑体" w:hAnsi="Times New Roman"/>
@@ -3387,7 +3387,7 @@
         <w:rPr>
           <w:color w:val="000000"/>
         </w:rPr>
-        <w:t>构建可运行的软件工作台和课程交付材料，使项目能够被复现、演示和审查。</w:t>
+        <w:t>构建可运行的软件工作台和项目归档材料，使项目能够被复现、演示和审查。</w:t>
       </w:r>
     </w:p>
     <w:p>
@@ -3491,7 +3491,7 @@
         <w:pStyle w:val="21"/>
         <w:spacing w:before="0" w:line="360" w:lineRule="exact"/>
       </w:pPr>
-      <w:bookmarkStart w:id="3" w:name="_Toc233836015"/>
+      <w:bookmarkStart w:id="3" w:name="_Toc233897008"/>
       <w:r>
         <w:rPr>
           <w:rFonts w:ascii="Times New Roman" w:eastAsia="黑体" w:hAnsi="Times New Roman"/>
@@ -4017,7 +4017,7 @@
                 <w:color w:val="000000"/>
                 <w:sz w:val="21"/>
               </w:rPr>
-              <w:t>工作台、运行解读模块、交互页面、代码入口、交付引用和课程交付页面设计。</w:t>
+              <w:t>工作台、运行解读模块、交互页面、代码入口、交付引用和训练控制页面设计。</w:t>
             </w:r>
           </w:p>
         </w:tc>
@@ -4229,7 +4229,7 @@
         <w:spacing w:before="360" w:after="360" w:line="360" w:lineRule="exact"/>
         <w:jc w:val="center"/>
       </w:pPr>
-      <w:bookmarkStart w:id="4" w:name="_Toc233836016"/>
+      <w:bookmarkStart w:id="4" w:name="_Toc233897009"/>
       <w:r>
         <w:rPr>
           <w:rFonts w:ascii="Times New Roman" w:eastAsia="黑体" w:hAnsi="Times New Roman"/>
@@ -4249,7 +4249,7 @@
         <w:pStyle w:val="21"/>
         <w:spacing w:before="0" w:line="360" w:lineRule="exact"/>
       </w:pPr>
-      <w:bookmarkStart w:id="5" w:name="_Toc233836017"/>
+      <w:bookmarkStart w:id="5" w:name="_Toc233897010"/>
       <w:r>
         <w:rPr>
           <w:rFonts w:ascii="Times New Roman" w:eastAsia="黑体" w:hAnsi="Times New Roman"/>
@@ -4309,7 +4309,7 @@
         <w:rPr>
           <w:color w:val="000000"/>
         </w:rPr>
-        <w:t>工作台与课程交付包中。</w:t>
+        <w:t>工作台与项目归档材料中。</w:t>
       </w:r>
     </w:p>
     <w:p>
@@ -4419,7 +4419,7 @@
         </w:rPr>
         <w:lastRenderedPageBreak/>
         <w:drawing>
-          <wp:inline distT="0" distB="0" distL="0" distR="0" wp14:anchorId="2886834E" wp14:editId="4B680F57">
+          <wp:inline distT="0" distB="0" distL="0" distR="0" wp14:anchorId="4C4D3CC4" wp14:editId="4A21118E">
             <wp:extent cx="4752000" cy="2304604"/>
             <wp:effectExtent l="0" t="0" r="0" b="0"/>
             <wp:docPr id="1" name="Picture 1"/>
@@ -4487,7 +4487,7 @@
         <w:pStyle w:val="21"/>
         <w:spacing w:before="0" w:line="360" w:lineRule="exact"/>
       </w:pPr>
-      <w:bookmarkStart w:id="6" w:name="_Toc233836018"/>
+      <w:bookmarkStart w:id="6" w:name="_Toc233897011"/>
       <w:r>
         <w:rPr>
           <w:rFonts w:ascii="Times New Roman" w:eastAsia="黑体" w:hAnsi="Times New Roman"/>
@@ -4729,7 +4729,7 @@
         <w:pStyle w:val="21"/>
         <w:spacing w:before="0" w:line="360" w:lineRule="exact"/>
       </w:pPr>
-      <w:bookmarkStart w:id="7" w:name="_Toc233836019"/>
+      <w:bookmarkStart w:id="7" w:name="_Toc233897012"/>
       <w:r>
         <w:rPr>
           <w:rFonts w:ascii="Times New Roman" w:eastAsia="黑体" w:hAnsi="Times New Roman"/>
@@ -5472,7 +5472,7 @@
                 <w:color w:val="000000"/>
                 <w:sz w:val="21"/>
               </w:rPr>
-              <w:t>展示结果、图表、交付材料、代码入口和运行控制。</w:t>
+              <w:t>展示结果、图表、引用材料、代码入口和训练控制。</w:t>
             </w:r>
           </w:p>
         </w:tc>
@@ -5590,7 +5590,7 @@
         <w:spacing w:before="360" w:after="360" w:line="360" w:lineRule="exact"/>
         <w:jc w:val="center"/>
       </w:pPr>
-      <w:bookmarkStart w:id="8" w:name="_Toc233836020"/>
+      <w:bookmarkStart w:id="8" w:name="_Toc233897013"/>
       <w:r>
         <w:rPr>
           <w:rFonts w:ascii="Times New Roman" w:eastAsia="黑体" w:hAnsi="Times New Roman"/>
@@ -5610,7 +5610,7 @@
         <w:pStyle w:val="21"/>
         <w:spacing w:before="0" w:line="360" w:lineRule="exact"/>
       </w:pPr>
-      <w:bookmarkStart w:id="9" w:name="_Toc233836021"/>
+      <w:bookmarkStart w:id="9" w:name="_Toc233897014"/>
       <w:r>
         <w:rPr>
           <w:rFonts w:ascii="Times New Roman" w:eastAsia="黑体" w:hAnsi="Times New Roman"/>
@@ -5799,7 +5799,7 @@
         <w:pStyle w:val="21"/>
         <w:spacing w:before="0" w:line="360" w:lineRule="exact"/>
       </w:pPr>
-      <w:bookmarkStart w:id="10" w:name="_Toc233836022"/>
+      <w:bookmarkStart w:id="10" w:name="_Toc233897015"/>
       <w:r>
         <w:rPr>
           <w:rFonts w:ascii="Times New Roman" w:eastAsia="黑体" w:hAnsi="Times New Roman"/>
@@ -5908,7 +5908,7 @@
           <w:noProof/>
         </w:rPr>
         <w:drawing>
-          <wp:inline distT="0" distB="0" distL="0" distR="0" wp14:anchorId="72216BCC" wp14:editId="0731603B">
+          <wp:inline distT="0" distB="0" distL="0" distR="0" wp14:anchorId="71AB5311" wp14:editId="549EB540">
             <wp:extent cx="4752000" cy="2328747"/>
             <wp:effectExtent l="0" t="0" r="0" b="0"/>
             <wp:docPr id="2" name="Picture 2"/>
@@ -5990,7 +5990,7 @@
         <w:pStyle w:val="21"/>
         <w:spacing w:before="0" w:line="360" w:lineRule="exact"/>
       </w:pPr>
-      <w:bookmarkStart w:id="11" w:name="_Toc233836023"/>
+      <w:bookmarkStart w:id="11" w:name="_Toc233897016"/>
       <w:r>
         <w:rPr>
           <w:rFonts w:ascii="Times New Roman" w:eastAsia="黑体" w:hAnsi="Times New Roman"/>
@@ -6243,7 +6243,7 @@
           <w:noProof/>
         </w:rPr>
         <w:drawing>
-          <wp:inline distT="0" distB="0" distL="0" distR="0" wp14:anchorId="0C45794D" wp14:editId="604B257C">
+          <wp:inline distT="0" distB="0" distL="0" distR="0" wp14:anchorId="679C3EAD" wp14:editId="701D584C">
             <wp:extent cx="4752000" cy="2340857"/>
             <wp:effectExtent l="0" t="0" r="0" b="0"/>
             <wp:docPr id="3" name="Picture 3"/>
@@ -6413,7 +6413,7 @@
         </w:rPr>
         <w:lastRenderedPageBreak/>
         <w:drawing>
-          <wp:inline distT="0" distB="0" distL="0" distR="0" wp14:anchorId="3DE9EDD3" wp14:editId="52558115">
+          <wp:inline distT="0" distB="0" distL="0" distR="0" wp14:anchorId="30D15991" wp14:editId="6A65D030">
             <wp:extent cx="4752000" cy="3878803"/>
             <wp:effectExtent l="0" t="0" r="0" b="0"/>
             <wp:docPr id="4" name="Picture 4"/>
@@ -6481,7 +6481,7 @@
         <w:pStyle w:val="21"/>
         <w:spacing w:before="0" w:line="360" w:lineRule="exact"/>
       </w:pPr>
-      <w:bookmarkStart w:id="12" w:name="_Toc233836024"/>
+      <w:bookmarkStart w:id="12" w:name="_Toc233897017"/>
       <w:r>
         <w:rPr>
           <w:rFonts w:ascii="Times New Roman" w:eastAsia="黑体" w:hAnsi="Times New Roman"/>
@@ -7267,7 +7267,7 @@
         <w:pStyle w:val="21"/>
         <w:spacing w:before="0" w:line="360" w:lineRule="exact"/>
       </w:pPr>
-      <w:bookmarkStart w:id="13" w:name="_Toc233836025"/>
+      <w:bookmarkStart w:id="13" w:name="_Toc233897018"/>
       <w:r>
         <w:rPr>
           <w:rFonts w:ascii="Times New Roman" w:eastAsia="黑体" w:hAnsi="Times New Roman"/>
@@ -7384,7 +7384,7 @@
         <w:pStyle w:val="21"/>
         <w:spacing w:before="0" w:line="360" w:lineRule="exact"/>
       </w:pPr>
-      <w:bookmarkStart w:id="14" w:name="_Toc233836026"/>
+      <w:bookmarkStart w:id="14" w:name="_Toc233897019"/>
       <w:r>
         <w:rPr>
           <w:rFonts w:ascii="Times New Roman" w:eastAsia="黑体" w:hAnsi="Times New Roman"/>
@@ -7414,7 +7414,7 @@
         <w:rPr>
           <w:color w:val="000000"/>
         </w:rPr>
-        <w:t>工作台是项目面向教师复现和视频演示的主入口。页面包括工作台、运行结果、交付引用、课程交付、代码与命令、运行解读和运行控制。工作台不使用题号式导航，而使用工程链路和运行视角组织信息，避免像</w:t>
+        <w:t>工作台是项目面向教师复现和视频演示的主入口。页面包括工作台、运行结果、交付引用、代码与命令、运行解读和训练控制。工作台不使用题号式导航，而使用工程链路和运行视角组织信息，避免像</w:t>
       </w:r>
       <w:r>
         <w:rPr>
@@ -7438,7 +7438,7 @@
         <w:rPr>
           <w:color w:val="000000"/>
         </w:rPr>
-        <w:t>。运行控制页默认只查看已有输出或</w:t>
+        <w:t>。训练控制页默认只查看已有输出或</w:t>
       </w:r>
       <w:r>
         <w:rPr>
@@ -7450,7 +7450,43 @@
         <w:rPr>
           <w:color w:val="000000"/>
         </w:rPr>
-        <w:t>预演，真正运行训练前需要显式确认，降低误操作风险。</w:t>
+        <w:t>预演，真正运行训练前需要显式确认，并通过后台日志展示</w:t>
+      </w:r>
+      <w:r>
+        <w:rPr>
+          <w:color w:val="000000"/>
+        </w:rPr>
+        <w:t xml:space="preserve"> Epoch </w:t>
+      </w:r>
+      <w:r>
+        <w:rPr>
+          <w:color w:val="000000"/>
+        </w:rPr>
+        <w:t>进度、</w:t>
+      </w:r>
+      <w:r>
+        <w:rPr>
+          <w:color w:val="000000"/>
+        </w:rPr>
+        <w:t xml:space="preserve">checkpoint </w:t>
+      </w:r>
+      <w:r>
+        <w:rPr>
+          <w:color w:val="000000"/>
+        </w:rPr>
+        <w:t>复用和停止</w:t>
+      </w:r>
+      <w:r>
+        <w:rPr>
+          <w:color w:val="000000"/>
+        </w:rPr>
+        <w:t>/</w:t>
+      </w:r>
+      <w:r>
+        <w:rPr>
+          <w:color w:val="000000"/>
+        </w:rPr>
+        <w:t>继续状态，降低误操作风险。</w:t>
       </w:r>
     </w:p>
     <w:p>
@@ -7513,7 +7549,7 @@
         <w:spacing w:before="360" w:after="360" w:line="360" w:lineRule="exact"/>
         <w:jc w:val="center"/>
       </w:pPr>
-      <w:bookmarkStart w:id="15" w:name="_Toc233836027"/>
+      <w:bookmarkStart w:id="15" w:name="_Toc233897020"/>
       <w:r>
         <w:rPr>
           <w:rFonts w:ascii="Times New Roman" w:eastAsia="黑体" w:hAnsi="Times New Roman"/>
@@ -7533,7 +7569,7 @@
         <w:pStyle w:val="21"/>
         <w:spacing w:before="0" w:line="360" w:lineRule="exact"/>
       </w:pPr>
-      <w:bookmarkStart w:id="16" w:name="_Toc233836028"/>
+      <w:bookmarkStart w:id="16" w:name="_Toc233897021"/>
       <w:r>
         <w:rPr>
           <w:rFonts w:ascii="Times New Roman" w:eastAsia="黑体" w:hAnsi="Times New Roman"/>
@@ -8268,7 +8304,7 @@
         <w:pStyle w:val="21"/>
         <w:spacing w:before="0" w:line="360" w:lineRule="exact"/>
       </w:pPr>
-      <w:bookmarkStart w:id="17" w:name="_Toc233836029"/>
+      <w:bookmarkStart w:id="17" w:name="_Toc233897022"/>
       <w:r>
         <w:rPr>
           <w:rFonts w:ascii="Times New Roman" w:eastAsia="黑体" w:hAnsi="Times New Roman"/>
@@ -8768,7 +8804,7 @@
         <w:pStyle w:val="21"/>
         <w:spacing w:before="0" w:line="360" w:lineRule="exact"/>
       </w:pPr>
-      <w:bookmarkStart w:id="18" w:name="_Toc233836030"/>
+      <w:bookmarkStart w:id="18" w:name="_Toc233897023"/>
       <w:r>
         <w:rPr>
           <w:rFonts w:ascii="Times New Roman" w:eastAsia="黑体" w:hAnsi="Times New Roman"/>
@@ -9334,7 +9370,7 @@
         <w:spacing w:before="360" w:after="360" w:line="360" w:lineRule="exact"/>
         <w:jc w:val="center"/>
       </w:pPr>
-      <w:bookmarkStart w:id="19" w:name="_Toc233836031"/>
+      <w:bookmarkStart w:id="19" w:name="_Toc233897024"/>
       <w:r>
         <w:rPr>
           <w:rFonts w:ascii="Times New Roman" w:eastAsia="黑体" w:hAnsi="Times New Roman"/>
@@ -9467,7 +9503,7 @@
         <w:spacing w:before="360" w:after="360" w:line="360" w:lineRule="exact"/>
         <w:jc w:val="center"/>
       </w:pPr>
-      <w:bookmarkStart w:id="20" w:name="_Toc233836032"/>
+      <w:bookmarkStart w:id="20" w:name="_Toc233897025"/>
       <w:r>
         <w:rPr>
           <w:rFonts w:ascii="Times New Roman" w:eastAsia="黑体" w:hAnsi="Times New Roman"/>
@@ -9559,7 +9595,7 @@
         <w:spacing w:before="360" w:after="360" w:line="360" w:lineRule="exact"/>
         <w:jc w:val="center"/>
       </w:pPr>
-      <w:bookmarkStart w:id="21" w:name="_Toc233836033"/>
+      <w:bookmarkStart w:id="21" w:name="_Toc233897026"/>
       <w:r>
         <w:rPr>
           <w:rFonts w:ascii="Times New Roman" w:eastAsia="黑体" w:hAnsi="Times New Roman"/>
@@ -9865,10 +9901,10 @@
               <w:noProof/>
             </w:rPr>
             <w:drawing>
-              <wp:inline distT="0" distB="0" distL="0" distR="0" wp14:anchorId="297E6891" wp14:editId="717E486E">
+              <wp:inline distT="0" distB="0" distL="0" distR="0" wp14:anchorId="6D1C7CC8" wp14:editId="78EBF1AC">
                 <wp:extent cx="1296000" cy="574363"/>
                 <wp:effectExtent l="0" t="0" r="0" b="0"/>
-                <wp:docPr id="694539435" name="Picture 1"/>
+                <wp:docPr id="1665615562" name="Picture 1"/>
                 <wp:cNvGraphicFramePr>
                   <a:graphicFrameLocks xmlns:a="http://schemas.openxmlformats.org/drawingml/2006/main" noChangeAspect="1"/>
                 </wp:cNvGraphicFramePr>
@@ -9921,7 +9957,7 @@
               <w:color w:val="000000"/>
               <w:sz w:val="18"/>
             </w:rPr>
-            <w:t>光伏电站日前计划与功率预测工作台项目主报告</w:t>
+            <w:t>光伏电站日前功率预测与运行工作台项目主报告</w:t>
           </w:r>
         </w:p>
       </w:tc>
@@ -10113,31 +10149,31 @@
       </w:rPr>
     </w:lvl>
   </w:abstractNum>
-  <w:num w:numId="1" w16cid:durableId="768308127">
+  <w:num w:numId="1" w16cid:durableId="1821263330">
     <w:abstractNumId w:val="8"/>
   </w:num>
-  <w:num w:numId="2" w16cid:durableId="1591040416">
+  <w:num w:numId="2" w16cid:durableId="1450196202">
     <w:abstractNumId w:val="6"/>
   </w:num>
-  <w:num w:numId="3" w16cid:durableId="1639140003">
+  <w:num w:numId="3" w16cid:durableId="2118675040">
     <w:abstractNumId w:val="5"/>
   </w:num>
-  <w:num w:numId="4" w16cid:durableId="713189453">
+  <w:num w:numId="4" w16cid:durableId="180163368">
     <w:abstractNumId w:val="4"/>
   </w:num>
-  <w:num w:numId="5" w16cid:durableId="851381743">
+  <w:num w:numId="5" w16cid:durableId="468127967">
     <w:abstractNumId w:val="7"/>
   </w:num>
-  <w:num w:numId="6" w16cid:durableId="1356418753">
+  <w:num w:numId="6" w16cid:durableId="1158502543">
     <w:abstractNumId w:val="3"/>
   </w:num>
-  <w:num w:numId="7" w16cid:durableId="1241938620">
+  <w:num w:numId="7" w16cid:durableId="1368141315">
     <w:abstractNumId w:val="2"/>
   </w:num>
-  <w:num w:numId="8" w16cid:durableId="1411191710">
+  <w:num w:numId="8" w16cid:durableId="1040203084">
     <w:abstractNumId w:val="1"/>
   </w:num>
-  <w:num w:numId="9" w16cid:durableId="617370830">
+  <w:num w:numId="9" w16cid:durableId="362436803">
     <w:abstractNumId w:val="0"/>
   </w:num>
 </w:numbering>
@@ -21562,7 +21598,7 @@
     <w:autoRedefine/>
     <w:uiPriority w:val="39"/>
     <w:unhideWhenUsed/>
-    <w:rsid w:val="001D3E7C"/>
+    <w:rsid w:val="00F560E8"/>
   </w:style>
   <w:style w:type="paragraph" w:styleId="TOC2">
     <w:name w:val="toc 2"/>
@@ -21571,7 +21607,7 @@
     <w:autoRedefine/>
     <w:uiPriority w:val="39"/>
     <w:unhideWhenUsed/>
-    <w:rsid w:val="001D3E7C"/>
+    <w:rsid w:val="00F560E8"/>
     <w:pPr>
       <w:ind w:leftChars="200" w:left="420"/>
     </w:pPr>
@@ -21581,7 +21617,7 @@
     <w:basedOn w:val="a2"/>
     <w:uiPriority w:val="99"/>
     <w:unhideWhenUsed/>
-    <w:rsid w:val="001D3E7C"/>
+    <w:rsid w:val="00F560E8"/>
     <w:rPr>
       <w:color w:val="0000FF" w:themeColor="hyperlink"/>
       <w:u w:val="single"/>

</xml_diff>